<commit_message>
Finalize report comments and source artifacts
</commit_message>
<xml_diff>
--- a/deliverables/final_project_report_working.docx
+++ b/deliverables/final_project_report_working.docx
@@ -503,7 +503,7 @@
         </w:rPr>
         <w:drawing>
           <wp:inline distT="0" distB="0" distL="0" distR="0" ns4:anchorId="1C489749" ns4:editId="27E0945B">
-            <wp:extent cx="5715000" cy="2115734"/>
+            <wp:extent cx="5715000" cy="2198077"/>
             <wp:effectExtent l="0" t="0" r="0" b="0"/>
             <wp:docPr id="1815190198" name="Picture 1815190198"/>
             <wp:cNvGraphicFramePr>
@@ -525,7 +525,7 @@
                   <pic:spPr>
                     <a:xfrm>
                       <a:off x="0" y="0"/>
-                      <a:ext cx="5715000" cy="2115734"/>
+                      <a:ext cx="5715000" cy="2198077"/>
                     </a:xfrm>
                     <a:prstGeom prst="rect">
                       <a:avLst/>

</xml_diff>